<commit_message>
Fix Word equations: split multi-line equations, shorten action-set equation, two-row table header, correct section cross-references
Co-Authored-By: Claude Sonnet 5.5 <noreply@anthropic.com>
Claude-Session: https://claude.ai/code/session_01U6LiEPsSJSoHgvUwD7nndr
</commit_message>
<xml_diff>
--- a/ieee_tr/submission/manuscript_IEEE_TR.docx
+++ b/ieee_tr/submission/manuscript_IEEE_TR.docx
@@ -425,7 +425,7 @@
         <w:pStyle w:val="Text"/>
       </w:pPr>
       <w:r>
-        <w:t xml:space="preserve">Section III reviews related work. Section IV defines the system, the degradation index, and the cost accounting. Section V analyzes the shock-and-wear process and the single-threshold renewal program. Section VI develops the imperfect-repair map. Section VII states the MDP and the control-limit result. Section VIII treats retrieval. Section IX presents numerical results and the measurement study, and Section X discusses limitations and operational implications before Section XI concludes. The proof of Proposition 1 is in the Appendix.</w:t>
+        <w:t xml:space="preserve">Section II reviews related work. Section III defines the system, the degradation index, and the cost accounting. Section IV analyzes the shock-and-wear process and the single-threshold renewal program. Section V develops the imperfect-repair map. Section VI states the MDP and the control-limit result. Section VII treats retrieval. Section VIII presents numerical results and the measurement study, and Section IX discusses limitations and operational implications before Section X concludes. The proof of Proposition 1 is in the Appendix.</w:t>
       </w:r>
     </w:p>
     <w:p>
@@ -513,7 +513,7 @@
         <w:t xml:space="preserve">et al.</w:t>
       </w:r>
       <w:r>
-        <w:t xml:space="preserve"> [20] give a rare empirical cadence comparison on a clinical prediction model, finding that monthly retraining was non-inferior to weekly retraining at roughly one quarter of the compute. This diminishing-returns pattern is what a square-root optimal interval predicts, as Section V makes explicit.</w:t>
+        <w:t xml:space="preserve"> [20] give a rare empirical cadence comparison on a clinical prediction model, finding that monthly retraining was non-inferior to weekly retraining at roughly one quarter of the compute. This diminishing-returns pattern is what a square-root optimal interval predicts, as Section IV makes explicit.</w:t>
       </w:r>
     </w:p>
     <w:p>
@@ -550,7 +550,7 @@
         <w:pStyle w:val="Text"/>
       </w:pPr>
       <w:r>
-        <w:t xml:space="preserve">Knowledge editing aims to rewrite a narrow fact while leaving unrelated behavior untouched [25], [26], and parameter-efficient fine-tuning such as LoRA [27] restricts the displacement to a low-rank or sparse subspace. In maintenance terms, both correspond to repairs that touch a small subset of components. Retrieval-augmented generation [28] differs in kind: the corpus is updated continuously and generation is conditioned on retrieved passages, so observed staleness can fall without any parameter displacement. Section VIII reads this architecture as a compensator in the control-theoretic sense.</w:t>
+        <w:t xml:space="preserve">Knowledge editing aims to rewrite a narrow fact while leaving unrelated behavior untouched [25], [26], and parameter-efficient fine-tuning such as LoRA [27] restricts the displacement to a low-rank or sparse subspace. In maintenance terms, both correspond to repairs that touch a small subset of components. Retrieval-augmented generation [28] differs in kind: the corpus is updated continuously and generation is conditioned on retrieved passages, so observed staleness can fall without any parameter displacement. Section VII reads this architecture as a compensator in the control-theoretic sense.</w:t>
       </w:r>
     </w:p>
     <w:p>
@@ -612,7 +612,7 @@
         <w:pStyle w:val="Text"/>
       </w:pPr>
       <w:r>
-        <w:t xml:space="preserve">Table I summarizes the mapping. Continual learning tells the maintainer how to execute an update, concept-drift work tells the maintainer when to trigger a cheap classical model, scaling laws say how costly a given update is, and CBM says how to control a deteriorating physical system. No strand jointly optimizes when, how much, and by which mechanism under a single average-cost criterion that charges both forgetting and money. That joint program is the subject of Sections IV–VIII.</w:t>
+        <w:t xml:space="preserve">Table I summarizes the mapping. Continual learning tells the maintainer how to execute an update, concept-drift work tells the maintainer when to trigger a cheap classical model, scaling laws say how costly a given update is, and CBM says how to control a deteriorating physical system. No strand jointly optimizes when, how much, and by which mechanism under a single average-cost criterion that charges both forgetting and money. That joint program is the subject of Sections III–VII.</w:t>
       </w:r>
     </w:p>
     <w:p>
@@ -2021,7 +2021,7 @@
         </m:r>
       </m:oMath>
       <w:r>
-        <w:t xml:space="preserve">; the affine growth models of Section V are local approximations valid while staleness lies well below that bound.</w:t>
+        <w:t xml:space="preserve">; the affine growth models of Section IV are local approximations valid while staleness lies well below that bound.</w:t>
       </w:r>
     </w:p>
     <w:p>
@@ -2294,7 +2294,7 @@
         </m:r>
       </m:oMath>
       <w:r>
-        <w:t xml:space="preserve"> and on its alignment with high-curvature directions of the pre-update loss, a dependence made explicit in Section VI.</w:t>
+        <w:t xml:space="preserve"> and on its alignment with high-curvature directions of the pre-update loss, a dependence made explicit in Section V.</w:t>
       </w:r>
     </w:p>
     <w:p>
@@ -3101,7 +3101,7 @@
         </m:r>
       </m:oMath>
       <w:r>
-        <w:t xml:space="preserve"> for full fine-tuning and understates the cost of efficient mechanisms; it is used in Section IX as a lower bound that isolates the part of cost that differs across mechanisms. Retrieval events incur an indexing cost </w:t>
+        <w:t xml:space="preserve"> for full fine-tuning and understates the cost of efficient mechanisms; it is used in Section VIII as a lower bound that isolates the part of cost that differs across mechanisms. Retrieval events incur an indexing cost </w:t>
       </w:r>
       <m:oMath>
         <m:sSub>
@@ -3128,6 +3128,292 @@
       <w:r>
         <w:t xml:space="preserve">The long-run objective is to choose maintenance times, displacements, and corpus updates to minimize the average cost rate</w:t>
       </w:r>
+    </w:p>
+    <w:p>
+      <w:pPr>
+        <w:pStyle w:val="Equation"/>
+        <w:keepNext/>
+        <w:tabs>
+          <w:tab w:val="clear" w:pos="5040"/>
+          <w:tab w:val="center" w:pos="2520"/>
+          <w:tab w:val="right" w:pos="5040"/>
+        </w:tabs>
+        <w:spacing w:before="60" w:after="0"/>
+      </w:pPr>
+      <w:r>
+        <w:tab/>
+      </w:r>
+      <m:oMath>
+        <m:r>
+          <m:t>J</m:t>
+        </m:r>
+        <m:r>
+          <m:rPr>
+            <m:sty m:val="p"/>
+          </m:rPr>
+          <m:t>=</m:t>
+        </m:r>
+        <m:sSub>
+          <m:e>
+            <m:r>
+              <m:rPr>
+                <m:sty m:val="p"/>
+              </m:rPr>
+              <m:t>limsup</m:t>
+            </m:r>
+          </m:e>
+          <m:sub>
+            <m:r>
+              <m:t>T</m:t>
+            </m:r>
+            <m:r>
+              <m:rPr>
+                <m:sty m:val="p"/>
+              </m:rPr>
+              <m:t>→</m:t>
+            </m:r>
+            <m:r>
+              <m:rPr>
+                <m:sty m:val="p"/>
+              </m:rPr>
+              <m:t>∞</m:t>
+            </m:r>
+          </m:sub>
+        </m:sSub>
+        <m:f>
+          <m:fPr>
+            <m:type m:val="bar"/>
+          </m:fPr>
+          <m:num>
+            <m:r>
+              <m:t>1</m:t>
+            </m:r>
+          </m:num>
+          <m:den>
+            <m:r>
+              <m:t>T</m:t>
+            </m:r>
+          </m:den>
+        </m:f>
+        <m:r>
+          <m:t> </m:t>
+        </m:r>
+        <m:r>
+          <m:rPr>
+            <m:scr m:val="double-struck"/>
+            <m:sty m:val="p"/>
+          </m:rPr>
+          <m:t>E</m:t>
+        </m:r>
+        <m:r>
+          <m:rPr>
+            <m:sty m:val="p"/>
+          </m:rPr>
+          <m:t>[</m:t>
+        </m:r>
+        <m:nary>
+          <m:naryPr>
+            <m:chr m:val="∫"/>
+            <m:limLoc m:val="subSup"/>
+            <m:subHide m:val="off"/>
+            <m:supHide m:val="off"/>
+          </m:naryPr>
+          <m:sub>
+            <m:r>
+              <m:t>0</m:t>
+            </m:r>
+          </m:sub>
+          <m:sup>
+            <m:r>
+              <m:t>T</m:t>
+            </m:r>
+          </m:sup>
+          <m:e>
+            <m:sSub>
+              <m:e>
+                <m:r>
+                  <m:t>c</m:t>
+                </m:r>
+              </m:e>
+              <m:sub>
+                <m:r>
+                  <m:t>L</m:t>
+                </m:r>
+              </m:sub>
+            </m:sSub>
+          </m:e>
+        </m:nary>
+        <m:r>
+          <m:t>D</m:t>
+        </m:r>
+        <m:d>
+          <m:dPr>
+            <m:begChr m:val="("/>
+            <m:sepChr m:val=""/>
+            <m:endChr m:val=")"/>
+            <m:grow/>
+          </m:dPr>
+          <m:e>
+            <m:r>
+              <m:t>t</m:t>
+            </m:r>
+          </m:e>
+        </m:d>
+        <m:r>
+          <m:t> </m:t>
+        </m:r>
+        <m:r>
+          <m:t>d</m:t>
+        </m:r>
+        <m:r>
+          <m:t>t</m:t>
+        </m:r>
+      </m:oMath>
+    </w:p>
+    <w:p>
+      <w:pPr>
+        <w:pStyle w:val="Equation"/>
+        <w:keepNext/>
+        <w:tabs>
+          <w:tab w:val="clear" w:pos="5040"/>
+          <w:tab w:val="center" w:pos="2520"/>
+          <w:tab w:val="right" w:pos="5040"/>
+        </w:tabs>
+        <w:spacing w:before="0" w:after="0"/>
+      </w:pPr>
+      <w:r>
+        <w:tab/>
+      </w:r>
+      <m:oMath>
+        <m:r>
+          <m:rPr>
+            <m:sty m:val="p"/>
+          </m:rPr>
+          <m:t>+</m:t>
+        </m:r>
+        <m:nary>
+          <m:naryPr>
+            <m:chr m:val="∑"/>
+            <m:limLoc m:val="undOvr"/>
+            <m:subHide m:val="off"/>
+            <m:supHide m:val="on"/>
+          </m:naryPr>
+          <m:sub>
+            <m:sSub>
+              <m:e>
+                <m:r>
+                  <m:t>τ</m:t>
+                </m:r>
+              </m:e>
+              <m:sub>
+                <m:r>
+                  <m:t>k</m:t>
+                </m:r>
+              </m:sub>
+            </m:sSub>
+            <m:r>
+              <m:rPr>
+                <m:sty m:val="p"/>
+              </m:rPr>
+              <m:t>≤</m:t>
+            </m:r>
+            <m:r>
+              <m:t>T</m:t>
+            </m:r>
+          </m:sub>
+          <m:sup>
+            <m:r>
+              <m:t>​</m:t>
+            </m:r>
+          </m:sup>
+          <m:e>
+            <m:d>
+              <m:dPr>
+                <m:begChr m:val="("/>
+                <m:sepChr m:val=""/>
+                <m:endChr m:val=")"/>
+                <m:grow/>
+              </m:dPr>
+              <m:e>
+                <m:r>
+                  <m:t>K</m:t>
+                </m:r>
+                <m:d>
+                  <m:dPr>
+                    <m:begChr m:val="("/>
+                    <m:sepChr m:val=""/>
+                    <m:endChr m:val=")"/>
+                    <m:grow/>
+                  </m:dPr>
+                  <m:e>
+                    <m:r>
+                      <m:t>Δ</m:t>
+                    </m:r>
+                    <m:sSub>
+                      <m:e>
+                        <m:r>
+                          <m:t>θ</m:t>
+                        </m:r>
+                      </m:e>
+                      <m:sub>
+                        <m:r>
+                          <m:t>k</m:t>
+                        </m:r>
+                      </m:sub>
+                    </m:sSub>
+                  </m:e>
+                </m:d>
+                <m:r>
+                  <m:rPr>
+                    <m:sty m:val="p"/>
+                  </m:rPr>
+                  <m:t>+</m:t>
+                </m:r>
+                <m:sSub>
+                  <m:e>
+                    <m:r>
+                      <m:t>c</m:t>
+                    </m:r>
+                  </m:e>
+                  <m:sub>
+                    <m:r>
+                      <m:t>F</m:t>
+                    </m:r>
+                  </m:sub>
+                </m:sSub>
+                <m:r>
+                  <m:t>F</m:t>
+                </m:r>
+                <m:d>
+                  <m:dPr>
+                    <m:begChr m:val="("/>
+                    <m:sepChr m:val=""/>
+                    <m:endChr m:val=")"/>
+                    <m:grow/>
+                  </m:dPr>
+                  <m:e>
+                    <m:r>
+                      <m:t>Δ</m:t>
+                    </m:r>
+                    <m:sSub>
+                      <m:e>
+                        <m:r>
+                          <m:t>θ</m:t>
+                        </m:r>
+                      </m:e>
+                      <m:sub>
+                        <m:r>
+                          <m:t>k</m:t>
+                        </m:r>
+                      </m:sub>
+                    </m:sSub>
+                  </m:e>
+                </m:d>
+              </m:e>
+            </m:d>
+          </m:e>
+        </m:nary>
+      </m:oMath>
     </w:p>
     <w:p>
       <w:pPr>
@@ -3137,411 +3423,137 @@
           <w:tab w:val="center" w:pos="2520"/>
           <w:tab w:val="right" w:pos="5040"/>
         </w:tabs>
-        <w:spacing w:before="60" w:after="60"/>
+        <w:spacing w:before="0" w:after="60"/>
       </w:pPr>
       <w:r>
         <w:tab/>
       </w:r>
       <m:oMath>
-        <m:m>
-          <m:mPr>
-            <m:baseJc m:val="center"/>
-            <m:plcHide m:val="on"/>
-            <m:mcs>
-              <m:mc>
-                <m:mcPr>
-                  <m:count m:val="1"/>
-                  <m:mcJc m:val="center"/>
-                </m:mcPr>
-              </m:mc>
-            </m:mcs>
-          </m:mPr>
-          <m:mr>
-            <m:e>
-              <m:r>
-                <m:t>J</m:t>
-              </m:r>
-              <m:r>
-                <m:rPr>
-                  <m:sty m:val="p"/>
-                </m:rPr>
-                <m:t>=</m:t>
-              </m:r>
-              <m:sSub>
-                <m:e>
-                  <m:r>
-                    <m:rPr>
-                      <m:sty m:val="p"/>
-                    </m:rPr>
-                    <m:t>limsup</m:t>
-                  </m:r>
-                </m:e>
-                <m:sub>
-                  <m:r>
-                    <m:t>T</m:t>
-                  </m:r>
-                  <m:r>
-                    <m:rPr>
-                      <m:sty m:val="p"/>
-                    </m:rPr>
-                    <m:t>→</m:t>
-                  </m:r>
-                  <m:r>
-                    <m:rPr>
-                      <m:sty m:val="p"/>
-                    </m:rPr>
-                    <m:t>∞</m:t>
-                  </m:r>
-                </m:sub>
-              </m:sSub>
-              <m:f>
-                <m:fPr>
-                  <m:type m:val="bar"/>
-                </m:fPr>
-                <m:num>
-                  <m:r>
-                    <m:t>1</m:t>
-                  </m:r>
-                </m:num>
-                <m:den>
-                  <m:r>
-                    <m:t>T</m:t>
-                  </m:r>
-                </m:den>
-              </m:f>
-              <m:r>
-                <m:t> </m:t>
-              </m:r>
-              <m:r>
-                <m:rPr>
-                  <m:scr m:val="double-struck"/>
-                  <m:sty m:val="p"/>
-                </m:rPr>
-                <m:t>E</m:t>
-              </m:r>
-              <m:r>
-                <m:rPr>
-                  <m:sty m:val="p"/>
-                </m:rPr>
-                <m:t>[</m:t>
-              </m:r>
-              <m:nary>
-                <m:naryPr>
-                  <m:chr m:val="∫"/>
-                  <m:limLoc m:val="subSup"/>
-                  <m:subHide m:val="off"/>
-                  <m:supHide m:val="off"/>
-                </m:naryPr>
-                <m:sub>
-                  <m:r>
-                    <m:t>0</m:t>
-                  </m:r>
-                </m:sub>
-                <m:sup>
-                  <m:r>
-                    <m:t>T</m:t>
-                  </m:r>
-                </m:sup>
-                <m:e>
-                  <m:sSub>
-                    <m:e>
-                      <m:r>
-                        <m:t>c</m:t>
-                      </m:r>
-                    </m:e>
-                    <m:sub>
-                      <m:r>
-                        <m:t>L</m:t>
-                      </m:r>
-                    </m:sub>
-                  </m:sSub>
-                </m:e>
-              </m:nary>
-              <m:r>
-                <m:t>D</m:t>
-              </m:r>
-              <m:d>
-                <m:dPr>
-                  <m:begChr m:val="("/>
-                  <m:sepChr m:val=""/>
-                  <m:endChr m:val=")"/>
-                  <m:grow/>
-                </m:dPr>
-                <m:e>
-                  <m:r>
-                    <m:t>t</m:t>
-                  </m:r>
-                </m:e>
-              </m:d>
-              <m:r>
-                <m:t> </m:t>
-              </m:r>
-              <m:r>
-                <m:t>d</m:t>
-              </m:r>
-              <m:r>
-                <m:t>t</m:t>
-              </m:r>
-            </m:e>
-          </m:mr>
-          <m:mr>
-            <m:e>
-              <m:r>
-                <m:rPr>
-                  <m:sty m:val="p"/>
-                </m:rPr>
-                <m:t>+</m:t>
-              </m:r>
-              <m:nary>
-                <m:naryPr>
-                  <m:chr m:val="∑"/>
-                  <m:limLoc m:val="undOvr"/>
-                  <m:subHide m:val="off"/>
-                  <m:supHide m:val="on"/>
-                </m:naryPr>
-                <m:sub>
-                  <m:sSub>
-                    <m:e>
-                      <m:r>
-                        <m:t>τ</m:t>
-                      </m:r>
-                    </m:e>
-                    <m:sub>
-                      <m:r>
-                        <m:t>k</m:t>
-                      </m:r>
-                    </m:sub>
-                  </m:sSub>
-                  <m:r>
-                    <m:rPr>
-                      <m:sty m:val="p"/>
-                    </m:rPr>
-                    <m:t>≤</m:t>
-                  </m:r>
-                  <m:r>
-                    <m:t>T</m:t>
-                  </m:r>
-                </m:sub>
-                <m:sup>
-                  <m:r>
-                    <m:t>​</m:t>
-                  </m:r>
-                </m:sup>
-                <m:e>
-                  <m:d>
-                    <m:dPr>
-                      <m:begChr m:val="("/>
-                      <m:sepChr m:val=""/>
-                      <m:endChr m:val=")"/>
-                      <m:grow/>
-                    </m:dPr>
-                    <m:e>
-                      <m:r>
-                        <m:t>K</m:t>
-                      </m:r>
-                      <m:d>
-                        <m:dPr>
-                          <m:begChr m:val="("/>
-                          <m:sepChr m:val=""/>
-                          <m:endChr m:val=")"/>
-                          <m:grow/>
-                        </m:dPr>
-                        <m:e>
-                          <m:r>
-                            <m:t>Δ</m:t>
-                          </m:r>
-                          <m:sSub>
-                            <m:e>
-                              <m:r>
-                                <m:t>θ</m:t>
-                              </m:r>
-                            </m:e>
-                            <m:sub>
-                              <m:r>
-                                <m:t>k</m:t>
-                              </m:r>
-                            </m:sub>
-                          </m:sSub>
-                        </m:e>
-                      </m:d>
-                      <m:r>
-                        <m:rPr>
-                          <m:sty m:val="p"/>
-                        </m:rPr>
-                        <m:t>+</m:t>
-                      </m:r>
-                      <m:sSub>
-                        <m:e>
-                          <m:r>
-                            <m:t>c</m:t>
-                          </m:r>
-                        </m:e>
-                        <m:sub>
-                          <m:r>
-                            <m:t>F</m:t>
-                          </m:r>
-                        </m:sub>
-                      </m:sSub>
-                      <m:r>
-                        <m:t>F</m:t>
-                      </m:r>
-                      <m:d>
-                        <m:dPr>
-                          <m:begChr m:val="("/>
-                          <m:sepChr m:val=""/>
-                          <m:endChr m:val=")"/>
-                          <m:grow/>
-                        </m:dPr>
-                        <m:e>
-                          <m:r>
-                            <m:t>Δ</m:t>
-                          </m:r>
-                          <m:sSub>
-                            <m:e>
-                              <m:r>
-                                <m:t>θ</m:t>
-                              </m:r>
-                            </m:e>
-                            <m:sub>
-                              <m:r>
-                                <m:t>k</m:t>
-                              </m:r>
-                            </m:sub>
-                          </m:sSub>
-                        </m:e>
-                      </m:d>
-                    </m:e>
-                  </m:d>
-                </m:e>
-              </m:nary>
-              <m:r>
-                <m:rPr>
-                  <m:sty m:val="p"/>
-                </m:rPr>
-                <m:t>+</m:t>
-              </m:r>
-              <m:nary>
-                <m:naryPr>
-                  <m:chr m:val="∫"/>
-                  <m:limLoc m:val="subSup"/>
-                  <m:subHide m:val="off"/>
-                  <m:supHide m:val="off"/>
-                </m:naryPr>
-                <m:sub>
-                  <m:r>
-                    <m:t>0</m:t>
-                  </m:r>
-                </m:sub>
-                <m:sup>
-                  <m:r>
-                    <m:t>T</m:t>
-                  </m:r>
-                </m:sup>
-                <m:e>
-                  <m:sSub>
-                    <m:e>
-                      <m:r>
-                        <m:t>k</m:t>
-                      </m:r>
-                    </m:e>
-                    <m:sub>
-                      <m:r>
-                        <m:t>C</m:t>
-                      </m:r>
-                    </m:sub>
-                  </m:sSub>
-                </m:e>
-              </m:nary>
-              <m:r>
-                <m:t> </m:t>
-              </m:r>
-              <m:sSub>
-                <m:e>
-                  <m:r>
-                    <m:rPr>
-                      <m:sty m:val="b"/>
-                    </m:rPr>
-                    <m:t>1</m:t>
-                  </m:r>
-                </m:e>
-                <m:sub>
-                  <m:r>
-                    <m:rPr>
-                      <m:sty m:val="p"/>
-                    </m:rPr>
-                    <m:t>{</m:t>
-                  </m:r>
-                  <m:r>
-                    <m:t>C</m:t>
-                  </m:r>
-                  <m:r>
-                    <m:rPr>
-                      <m:sty m:val="p"/>
-                    </m:rPr>
-                    <m:t>a</m:t>
-                  </m:r>
-                  <m:r>
-                    <m:rPr>
-                      <m:sty m:val="p"/>
-                    </m:rPr>
-                    <m:t>c</m:t>
-                  </m:r>
-                  <m:r>
-                    <m:rPr>
-                      <m:sty m:val="p"/>
-                    </m:rPr>
-                    <m:t>t</m:t>
-                  </m:r>
-                  <m:r>
-                    <m:rPr>
-                      <m:sty m:val="p"/>
-                    </m:rPr>
-                    <m:t>i</m:t>
-                  </m:r>
-                  <m:r>
-                    <m:rPr>
-                      <m:sty m:val="p"/>
-                    </m:rPr>
-                    <m:t>v</m:t>
-                  </m:r>
-                  <m:r>
-                    <m:rPr>
-                      <m:sty m:val="p"/>
-                    </m:rPr>
-                    <m:t>e</m:t>
-                  </m:r>
-                  <m:r>
-                    <m:rPr>
-                      <m:sty m:val="p"/>
-                    </m:rPr>
-                    <m:t>}</m:t>
-                  </m:r>
-                </m:sub>
-              </m:sSub>
-              <m:r>
-                <m:t> </m:t>
-              </m:r>
-              <m:r>
-                <m:t>d</m:t>
-              </m:r>
-              <m:r>
-                <m:t>t</m:t>
-              </m:r>
-              <m:r>
-                <m:rPr>
-                  <m:sty m:val="p"/>
-                </m:rPr>
-                <m:t>]</m:t>
-              </m:r>
-              <m:r>
-                <m:rPr>
-                  <m:sty m:val="p"/>
-                </m:rPr>
-                <m:t>.</m:t>
-              </m:r>
-            </m:e>
-          </m:mr>
-        </m:m>
+        <m:r>
+          <m:rPr>
+            <m:sty m:val="p"/>
+          </m:rPr>
+          <m:t>+</m:t>
+        </m:r>
+        <m:nary>
+          <m:naryPr>
+            <m:chr m:val="∫"/>
+            <m:limLoc m:val="subSup"/>
+            <m:subHide m:val="off"/>
+            <m:supHide m:val="off"/>
+          </m:naryPr>
+          <m:sub>
+            <m:r>
+              <m:t>0</m:t>
+            </m:r>
+          </m:sub>
+          <m:sup>
+            <m:r>
+              <m:t>T</m:t>
+            </m:r>
+          </m:sup>
+          <m:e>
+            <m:sSub>
+              <m:e>
+                <m:r>
+                  <m:t>k</m:t>
+                </m:r>
+              </m:e>
+              <m:sub>
+                <m:r>
+                  <m:t>C</m:t>
+                </m:r>
+              </m:sub>
+            </m:sSub>
+          </m:e>
+        </m:nary>
+        <m:r>
+          <m:t> </m:t>
+        </m:r>
+        <m:sSub>
+          <m:e>
+            <m:r>
+              <m:rPr>
+                <m:sty m:val="b"/>
+              </m:rPr>
+              <m:t>1</m:t>
+            </m:r>
+          </m:e>
+          <m:sub>
+            <m:r>
+              <m:rPr>
+                <m:sty m:val="p"/>
+              </m:rPr>
+              <m:t>{</m:t>
+            </m:r>
+            <m:r>
+              <m:t>C</m:t>
+            </m:r>
+            <m:r>
+              <m:rPr>
+                <m:sty m:val="p"/>
+              </m:rPr>
+              <m:t>a</m:t>
+            </m:r>
+            <m:r>
+              <m:rPr>
+                <m:sty m:val="p"/>
+              </m:rPr>
+              <m:t>c</m:t>
+            </m:r>
+            <m:r>
+              <m:rPr>
+                <m:sty m:val="p"/>
+              </m:rPr>
+              <m:t>t</m:t>
+            </m:r>
+            <m:r>
+              <m:rPr>
+                <m:sty m:val="p"/>
+              </m:rPr>
+              <m:t>i</m:t>
+            </m:r>
+            <m:r>
+              <m:rPr>
+                <m:sty m:val="p"/>
+              </m:rPr>
+              <m:t>v</m:t>
+            </m:r>
+            <m:r>
+              <m:rPr>
+                <m:sty m:val="p"/>
+              </m:rPr>
+              <m:t>e</m:t>
+            </m:r>
+            <m:r>
+              <m:rPr>
+                <m:sty m:val="p"/>
+              </m:rPr>
+              <m:t>}</m:t>
+            </m:r>
+          </m:sub>
+        </m:sSub>
+        <m:r>
+          <m:t> </m:t>
+        </m:r>
+        <m:r>
+          <m:t>d</m:t>
+        </m:r>
+        <m:r>
+          <m:t>t</m:t>
+        </m:r>
+        <m:r>
+          <m:rPr>
+            <m:sty m:val="p"/>
+          </m:rPr>
+          <m:t>]</m:t>
+        </m:r>
+        <m:r>
+          <m:rPr>
+            <m:sty m:val="p"/>
+          </m:rPr>
+          <m:t>.</m:t>
+        </m:r>
       </m:oMath>
       <w:r>
         <w:tab/>
@@ -3693,7 +3705,7 @@
         </m:r>
       </m:oMath>
       <w:r>
-        <w:t xml:space="preserve">. In deployment a model is scored on many axes that can drift at different rates; Section X returns to the vector extension.</w:t>
+        <w:t xml:space="preserve">. In deployment a model is scored on many axes that can drift at different rates; Section IX returns to the vector extension.</w:t>
       </w:r>
     </w:p>
     <w:p>
@@ -5413,7 +5425,7 @@
         </m:r>
       </m:oMath>
       <w:r>
-        <w:t xml:space="preserve"> and shortens the indicated calendar interval. Under increasing mean residual life the opposite adjustment is indicated, and a heuristic that treats every quiet spell as a reason to maintain sooner is miscalibrated. The two regimes can be told apart from the hazard of drift-detector alarms. Section VII folds the distinction into the MDP as an exogenous regime variable, so that the direction of the threshold shift is a numerical output and not an assumption.</w:t>
+        <w:t xml:space="preserve"> and shortens the indicated calendar interval. Under increasing mean residual life the opposite adjustment is indicated, and a heuristic that treats every quiet spell as a reason to maintain sooner is miscalibrated. The two regimes can be told apart from the hazard of drift-detector alarms. Section VI folds the distinction into the MDP as an exogenous regime variable, so that the direction of the threshold shift is a numerical output and not an assumption.</w:t>
       </w:r>
     </w:p>
     <w:p>
@@ -5545,7 +5557,7 @@
         </m:r>
       </m:oMath>
       <w:r>
-        <w:t xml:space="preserve"> is the coefficient of an OLS regression of measured staleness on time since the last repair, pooled across cycles. A nonzero intercept reflects residual error of the freshly maintained model and does not affect the slope. Departures from affinity diagnose either non-Poisson arrivals or saturation. Section IX runs this regression on a public model.</w:t>
+        <w:t xml:space="preserve"> is the coefficient of an OLS regression of measured staleness on time since the last repair, pooled across cycles. A nonzero intercept reflects residual error of the freshly maintained model and does not affect the slope. Departures from affinity diagnose either non-Poisson arrivals or saturation. Section VIII runs this regression on a public model.</w:t>
       </w:r>
     </w:p>
     <w:p>
@@ -6332,7 +6344,7 @@
         <w:pStyle w:val="Text"/>
       </w:pPr>
       <w:r>
-        <w:t xml:space="preserve">By the accounting of Section IV, the mechanism-dependent part of </w:t>
+        <w:t xml:space="preserve">By the accounting of Section III, the mechanism-dependent part of </w:t>
       </w:r>
       <m:oMath>
         <m:r>
@@ -6351,7 +6363,7 @@
         </m:r>
       </m:oMath>
       <w:r>
-        <w:t xml:space="preserve">, not its Fisher-weighted size. Section IX records a measured violation.</w:t>
+        <w:t xml:space="preserve">, not its Fisher-weighted size. Section VIII records a measured violation.</w:t>
       </w:r>
     </w:p>
     <w:p>
@@ -6848,327 +6860,271 @@
     <w:p>
       <w:pPr>
         <w:pStyle w:val="Equation"/>
+        <w:keepNext/>
         <w:tabs>
           <w:tab w:val="clear" w:pos="5040"/>
           <w:tab w:val="center" w:pos="2520"/>
           <w:tab w:val="right" w:pos="5040"/>
         </w:tabs>
-        <w:spacing w:before="60" w:after="60"/>
+        <w:spacing w:before="60" w:after="0"/>
       </w:pPr>
       <w:r>
         <w:tab/>
       </w:r>
       <m:oMath>
-        <m:m>
-          <m:mPr>
-            <m:baseJc m:val="center"/>
-            <m:plcHide m:val="on"/>
-            <m:mcs>
-              <m:mc>
-                <m:mcPr>
-                  <m:count m:val="1"/>
-                  <m:mcJc m:val="center"/>
-                </m:mcPr>
-              </m:mc>
-            </m:mcs>
-          </m:mPr>
-          <m:mr>
-            <m:e>
-              <m:sSup>
-                <m:e>
-                  <m:r>
-                    <m:t>δ</m:t>
-                  </m:r>
-                </m:e>
-                <m:sup>
-                  <m:r>
-                    <m:rPr>
-                      <m:sty m:val="p"/>
-                    </m:rPr>
-                    <m:t>*</m:t>
-                  </m:r>
-                </m:sup>
-              </m:sSup>
-              <m:r>
-                <m:rPr>
-                  <m:sty m:val="p"/>
-                </m:rPr>
-                <m:t>=</m:t>
-              </m:r>
-              <m:rad>
-                <m:radPr>
-                  <m:degHide m:val="on"/>
-                </m:radPr>
-                <m:deg/>
-                <m:e>
-                  <m:f>
-                    <m:fPr>
-                      <m:type m:val="bar"/>
-                    </m:fPr>
-                    <m:num>
-                      <m:r>
-                        <m:t>2</m:t>
-                      </m:r>
-                      <m:d>
-                        <m:dPr>
-                          <m:begChr m:val="("/>
-                          <m:sepChr m:val=""/>
-                          <m:endChr m:val=")"/>
-                          <m:grow/>
-                        </m:dPr>
-                        <m:e>
-                          <m:r>
-                            <m:t>K</m:t>
-                          </m:r>
-                          <m:r>
-                            <m:rPr>
-                              <m:sty m:val="p"/>
-                            </m:rPr>
-                            <m:t>+</m:t>
-                          </m:r>
-                          <m:sSub>
-                            <m:e>
-                              <m:r>
-                                <m:t>c</m:t>
-                              </m:r>
-                            </m:e>
-                            <m:sub>
-                              <m:r>
-                                <m:t>F</m:t>
-                              </m:r>
-                            </m:sub>
-                          </m:sSub>
-                          <m:r>
-                            <m:t>F</m:t>
-                          </m:r>
-                        </m:e>
-                      </m:d>
-                      <m:r>
-                        <m:t>γ</m:t>
-                      </m:r>
-                    </m:num>
-                    <m:den>
-                      <m:sSub>
-                        <m:e>
-                          <m:r>
-                            <m:t>c</m:t>
-                          </m:r>
-                        </m:e>
-                        <m:sub>
-                          <m:r>
-                            <m:t>L</m:t>
-                          </m:r>
-                        </m:sub>
-                      </m:sSub>
-                    </m:den>
-                  </m:f>
-                </m:e>
-              </m:rad>
-              <m:r>
-                <m:rPr>
-                  <m:sty m:val="p"/>
-                </m:rPr>
-                <m:t>,</m:t>
-              </m:r>
-              <m:r>
-                <m:t>  </m:t>
-              </m:r>
-              <m:sSup>
-                <m:e>
-                  <m:r>
-                    <m:t>t</m:t>
-                  </m:r>
-                </m:e>
-                <m:sup>
-                  <m:r>
-                    <m:rPr>
-                      <m:sty m:val="p"/>
-                    </m:rPr>
-                    <m:t>*</m:t>
-                  </m:r>
-                </m:sup>
-              </m:sSup>
-              <m:r>
-                <m:rPr>
-                  <m:sty m:val="p"/>
-                </m:rPr>
-                <m:t>=</m:t>
-              </m:r>
-              <m:f>
-                <m:fPr>
-                  <m:type m:val="bar"/>
-                </m:fPr>
-                <m:num>
-                  <m:sSup>
-                    <m:e>
-                      <m:r>
-                        <m:t>δ</m:t>
-                      </m:r>
-                    </m:e>
-                    <m:sup>
-                      <m:r>
-                        <m:rPr>
-                          <m:sty m:val="p"/>
-                        </m:rPr>
-                        <m:t>*</m:t>
-                      </m:r>
-                    </m:sup>
-                  </m:sSup>
-                </m:num>
-                <m:den>
-                  <m:r>
-                    <m:t>γ</m:t>
-                  </m:r>
-                </m:den>
-              </m:f>
-              <m:r>
-                <m:rPr>
-                  <m:sty m:val="p"/>
-                </m:rPr>
-                <m:t>,</m:t>
-              </m:r>
-              <m:r>
-                <m:t> </m:t>
-              </m:r>
-              <m:sSup>
-                <m:e>
-                  <m:r>
-                    <m:t>J</m:t>
-                  </m:r>
-                </m:e>
-                <m:sup>
-                  <m:r>
-                    <m:rPr>
-                      <m:sty m:val="p"/>
-                    </m:rPr>
-                    <m:t>*</m:t>
-                  </m:r>
-                </m:sup>
-              </m:sSup>
-              <m:r>
-                <m:rPr>
-                  <m:sty m:val="p"/>
-                </m:rPr>
-                <m:t>=</m:t>
-              </m:r>
-              <m:rad>
-                <m:radPr>
-                  <m:degHide m:val="on"/>
-                </m:radPr>
-                <m:deg/>
-                <m:e>
-                  <m:r>
-                    <m:t>2</m:t>
-                  </m:r>
-                  <m:sSub>
-                    <m:e>
-                      <m:r>
-                        <m:t>c</m:t>
-                      </m:r>
-                    </m:e>
-                    <m:sub>
-                      <m:r>
-                        <m:t>L</m:t>
-                      </m:r>
-                    </m:sub>
-                  </m:sSub>
-                  <m:r>
-                    <m:t>γ</m:t>
-                  </m:r>
-                  <m:r>
-                    <m:t> </m:t>
-                  </m:r>
-                  <m:d>
-                    <m:dPr>
-                      <m:begChr m:val="("/>
-                      <m:sepChr m:val=""/>
-                      <m:endChr m:val=")"/>
-                      <m:grow/>
-                    </m:dPr>
-                    <m:e>
-                      <m:r>
-                        <m:t>K</m:t>
-                      </m:r>
-                      <m:r>
-                        <m:rPr>
-                          <m:sty m:val="p"/>
-                        </m:rPr>
-                        <m:t>+</m:t>
-                      </m:r>
-                      <m:sSub>
-                        <m:e>
-                          <m:r>
-                            <m:t>c</m:t>
-                          </m:r>
-                        </m:e>
-                        <m:sub>
-                          <m:r>
-                            <m:t>F</m:t>
-                          </m:r>
-                        </m:sub>
-                      </m:sSub>
-                      <m:r>
-                        <m:t>F</m:t>
-                      </m:r>
-                    </m:e>
-                  </m:d>
-                </m:e>
-              </m:rad>
-              <m:r>
-                <m:rPr>
-                  <m:sty m:val="p"/>
-                </m:rPr>
-                <m:t>+</m:t>
-              </m:r>
-              <m:sSub>
-                <m:e>
-                  <m:r>
-                    <m:t>c</m:t>
-                  </m:r>
-                </m:e>
-                <m:sub>
-                  <m:r>
-                    <m:t>L</m:t>
-                  </m:r>
-                </m:sub>
-              </m:sSub>
-              <m:r>
-                <m:t>F</m:t>
-              </m:r>
-              <m:r>
-                <m:rPr>
-                  <m:sty m:val="p"/>
-                </m:rPr>
-                <m:t>.</m:t>
-              </m:r>
-            </m:e>
-          </m:mr>
-        </m:m>
-      </m:oMath>
+        <m:sSup>
+          <m:e>
+            <m:r>
+              <m:t>δ</m:t>
+            </m:r>
+          </m:e>
+          <m:sup>
+            <m:r>
+              <m:rPr>
+                <m:sty m:val="p"/>
+              </m:rPr>
+              <m:t>*</m:t>
+            </m:r>
+          </m:sup>
+        </m:sSup>
+        <m:r>
+          <m:rPr>
+            <m:sty m:val="p"/>
+          </m:rPr>
+          <m:t>=</m:t>
+        </m:r>
+        <m:rad>
+          <m:radPr>
+            <m:degHide m:val="on"/>
+          </m:radPr>
+          <m:deg/>
+          <m:e>
+            <m:f>
+              <m:fPr>
+                <m:type m:val="bar"/>
+              </m:fPr>
+              <m:num>
+                <m:r>
+                  <m:t>2</m:t>
+                </m:r>
+                <m:d>
+                  <m:dPr>
+                    <m:begChr m:val="("/>
+                    <m:sepChr m:val=""/>
+                    <m:endChr m:val=")"/>
+                    <m:grow/>
+                  </m:dPr>
+                  <m:e>
+                    <m:r>
+                      <m:t>K</m:t>
+                    </m:r>
+                    <m:r>
+                      <m:rPr>
+                        <m:sty m:val="p"/>
+                      </m:rPr>
+                      <m:t>+</m:t>
+                    </m:r>
+                    <m:sSub>
+                      <m:e>
+                        <m:r>
+                          <m:t>c</m:t>
+                        </m:r>
+                      </m:e>
+                      <m:sub>
+                        <m:r>
+                          <m:t>F</m:t>
+                        </m:r>
+                      </m:sub>
+                    </m:sSub>
+                    <m:r>
+                      <m:t>F</m:t>
+                    </m:r>
+                  </m:e>
+                </m:d>
+                <m:r>
+                  <m:t>γ</m:t>
+                </m:r>
+              </m:num>
+              <m:den>
+                <m:sSub>
+                  <m:e>
+                    <m:r>
+                      <m:t>c</m:t>
+                    </m:r>
+                  </m:e>
+                  <m:sub>
+                    <m:r>
+                      <m:t>L</m:t>
+                    </m:r>
+                  </m:sub>
+                </m:sSub>
+              </m:den>
+            </m:f>
+          </m:e>
+        </m:rad>
+        <m:r>
+          <m:rPr>
+            <m:sty m:val="p"/>
+          </m:rPr>
+          <m:t>,</m:t>
+        </m:r>
+        <m:r>
+          <m:t>  </m:t>
+        </m:r>
+        <m:sSup>
+          <m:e>
+            <m:r>
+              <m:t>t</m:t>
+            </m:r>
+          </m:e>
+          <m:sup>
+            <m:r>
+              <m:rPr>
+                <m:sty m:val="p"/>
+              </m:rPr>
+              <m:t>*</m:t>
+            </m:r>
+          </m:sup>
+        </m:sSup>
+        <m:r>
+          <m:rPr>
+            <m:sty m:val="p"/>
+          </m:rPr>
+          <m:t>=</m:t>
+        </m:r>
+        <m:f>
+          <m:fPr>
+            <m:type m:val="bar"/>
+          </m:fPr>
+          <m:num>
+            <m:sSup>
+              <m:e>
+                <m:r>
+                  <m:t>δ</m:t>
+                </m:r>
+              </m:e>
+              <m:sup>
+                <m:r>
+                  <m:rPr>
+                    <m:sty m:val="p"/>
+                  </m:rPr>
+                  <m:t>*</m:t>
+                </m:r>
+              </m:sup>
+            </m:sSup>
+          </m:num>
+          <m:den>
+            <m:r>
+              <m:t>γ</m:t>
+            </m:r>
+          </m:den>
+        </m:f>
+        <m:r>
+          <m:rPr>
+            <m:sty m:val="p"/>
+          </m:rPr>
+          <m:t>,</m:t>
+        </m:r>
+      </m:oMath>
+    </w:p>
+    <w:p>
+      <w:pPr>
+        <w:pStyle w:val="Equation"/>
+        <w:tabs>
+          <w:tab w:val="clear" w:pos="5040"/>
+          <w:tab w:val="center" w:pos="2520"/>
+          <w:tab w:val="right" w:pos="5040"/>
+        </w:tabs>
+        <w:spacing w:before="0" w:after="60"/>
+      </w:pPr>
       <w:r>
         <w:tab/>
-        <w:t>(15)</w:t>
-      </w:r>
-    </w:p>
-    <w:p>
-      <w:pPr>
-        <w:pStyle w:val="Text"/>
-      </w:pPr>
-      <w:r>
-        <w:t xml:space="preserve">The optimal cost rate therefore rises through two channels: the effective one-off cost inflates from </w:t>
-      </w:r>
-      <m:oMath>
-        <m:r>
-          <m:t>K</m:t>
-        </m:r>
-      </m:oMath>
-      <w:r>
-        <w:t xml:space="preserve"> to </w:t>
-      </w:r>
-      <m:oMath>
-        <m:r>
-          <m:t>K</m:t>
-        </m:r>
+      </w:r>
+      <m:oMath>
+        <m:sSup>
+          <m:e>
+            <m:r>
+              <m:t>J</m:t>
+            </m:r>
+          </m:e>
+          <m:sup>
+            <m:r>
+              <m:rPr>
+                <m:sty m:val="p"/>
+              </m:rPr>
+              <m:t>*</m:t>
+            </m:r>
+          </m:sup>
+        </m:sSup>
+        <m:r>
+          <m:rPr>
+            <m:sty m:val="p"/>
+          </m:rPr>
+          <m:t>=</m:t>
+        </m:r>
+        <m:rad>
+          <m:radPr>
+            <m:degHide m:val="on"/>
+          </m:radPr>
+          <m:deg/>
+          <m:e>
+            <m:r>
+              <m:t>2</m:t>
+            </m:r>
+            <m:sSub>
+              <m:e>
+                <m:r>
+                  <m:t>c</m:t>
+                </m:r>
+              </m:e>
+              <m:sub>
+                <m:r>
+                  <m:t>L</m:t>
+                </m:r>
+              </m:sub>
+            </m:sSub>
+            <m:r>
+              <m:t>γ</m:t>
+            </m:r>
+            <m:r>
+              <m:t> </m:t>
+            </m:r>
+            <m:d>
+              <m:dPr>
+                <m:begChr m:val="("/>
+                <m:sepChr m:val=""/>
+                <m:endChr m:val=")"/>
+                <m:grow/>
+              </m:dPr>
+              <m:e>
+                <m:r>
+                  <m:t>K</m:t>
+                </m:r>
+                <m:r>
+                  <m:rPr>
+                    <m:sty m:val="p"/>
+                  </m:rPr>
+                  <m:t>+</m:t>
+                </m:r>
+                <m:sSub>
+                  <m:e>
+                    <m:r>
+                      <m:t>c</m:t>
+                    </m:r>
+                  </m:e>
+                  <m:sub>
+                    <m:r>
+                      <m:t>F</m:t>
+                    </m:r>
+                  </m:sub>
+                </m:sSub>
+                <m:r>
+                  <m:t>F</m:t>
+                </m:r>
+              </m:e>
+            </m:d>
+          </m:e>
+        </m:rad>
         <m:r>
           <m:rPr>
             <m:sty m:val="p"/>
@@ -7183,6 +7139,58 @@
           </m:e>
           <m:sub>
             <m:r>
+              <m:t>L</m:t>
+            </m:r>
+          </m:sub>
+        </m:sSub>
+        <m:r>
+          <m:t>F</m:t>
+        </m:r>
+        <m:r>
+          <m:rPr>
+            <m:sty m:val="p"/>
+          </m:rPr>
+          <m:t>.</m:t>
+        </m:r>
+      </m:oMath>
+      <w:r>
+        <w:tab/>
+        <w:t>(15)</w:t>
+      </w:r>
+    </w:p>
+    <w:p>
+      <w:pPr>
+        <w:pStyle w:val="Text"/>
+      </w:pPr>
+      <w:r>
+        <w:t xml:space="preserve">The optimal cost rate therefore rises through two channels: the effective one-off cost inflates from </w:t>
+      </w:r>
+      <m:oMath>
+        <m:r>
+          <m:t>K</m:t>
+        </m:r>
+      </m:oMath>
+      <w:r>
+        <w:t xml:space="preserve"> to </w:t>
+      </w:r>
+      <m:oMath>
+        <m:r>
+          <m:t>K</m:t>
+        </m:r>
+        <m:r>
+          <m:rPr>
+            <m:sty m:val="p"/>
+          </m:rPr>
+          <m:t>+</m:t>
+        </m:r>
+        <m:sSub>
+          <m:e>
+            <m:r>
+              <m:t>c</m:t>
+            </m:r>
+          </m:e>
+          <m:sub>
+            <m:r>
               <m:t>F</m:t>
             </m:r>
           </m:sub>
@@ -7310,7 +7318,7 @@
         </m:r>
       </m:oMath>
       <w:r>
-        <w:t xml:space="preserve"> alone: a cheap mechanism with large residual damage can lose to an expensive perfect repair because of the permanent term. This comparative static runs opposite to the drift-intensity effect in Section V and is the second closed-form prediction of the paper. Fig. 2 shows the resulting U-shaped cost-rate curves and the rightward shift of the minimizer as residual damage grows.</w:t>
+        <w:t xml:space="preserve"> alone: a cheap mechanism with large residual damage can lose to an expensive perfect repair because of the permanent term. This comparative static runs opposite to the drift-intensity effect in Section IV and is the second closed-form prediction of the paper. Fig. 2 shows the resulting U-shaped cost-rate curves and the rightward shift of the minimizer as residual damage grows.</w:t>
       </w:r>
     </w:p>
     <w:p>
@@ -7486,79 +7494,52 @@
         <w:tab/>
       </w:r>
       <m:oMath>
-        <m:m>
-          <m:mPr>
-            <m:baseJc m:val="center"/>
-            <m:plcHide m:val="on"/>
-            <m:mcs>
-              <m:mc>
-                <m:mcPr>
-                  <m:count m:val="1"/>
-                  <m:mcJc m:val="center"/>
-                </m:mcPr>
-              </m:mc>
-            </m:mcs>
-          </m:mPr>
-          <m:mr>
-            <m:e>
-              <m:r>
-                <m:t>a</m:t>
-              </m:r>
-              <m:r>
-                <m:rPr>
-                  <m:sty m:val="p"/>
-                </m:rPr>
-                <m:t>∈</m:t>
-              </m:r>
-              <m:r>
-                <m:rPr>
-                  <m:scr m:val="script"/>
-                  <m:sty m:val="p"/>
-                </m:rPr>
-                <m:t>A</m:t>
-              </m:r>
-              <m:r>
-                <m:rPr>
-                  <m:sty m:val="p"/>
-                </m:rPr>
-                <m:t>=</m:t>
-              </m:r>
-              <m:r>
-                <m:rPr>
-                  <m:sty m:val="p"/>
-                </m:rPr>
-                <m:t>{</m:t>
-              </m:r>
-              <m:r>
-                <m:rPr>
-                  <m:nor/>
-                </m:rPr>
-                <m:t>no-op, knowledge edit,</m:t>
-              </m:r>
-              <m:r>
-                <m:t> </m:t>
-              </m:r>
-              <m:r>
-                <m:rPr>
-                  <m:nor/>
-                </m:rPr>
-                <m:t>parameter-efficient fine-tune, full retrain</m:t>
-              </m:r>
-              <m:r>
-                <m:rPr>
-                  <m:sty m:val="p"/>
-                </m:rPr>
-                <m:t>}</m:t>
-              </m:r>
-              <m:r>
-                <m:rPr>
-                  <m:sty m:val="p"/>
-                </m:rPr>
-                <m:t>,</m:t>
-              </m:r>
-            </m:e>
-          </m:mr>
-        </m:m>
+        <m:r>
+          <m:t>a</m:t>
+        </m:r>
+        <m:r>
+          <m:rPr>
+            <m:sty m:val="p"/>
+          </m:rPr>
+          <m:t>∈</m:t>
+        </m:r>
+        <m:r>
+          <m:rPr>
+            <m:scr m:val="script"/>
+            <m:sty m:val="p"/>
+          </m:rPr>
+          <m:t>A</m:t>
+        </m:r>
+        <m:r>
+          <m:rPr>
+            <m:sty m:val="p"/>
+          </m:rPr>
+          <m:t>=</m:t>
+        </m:r>
+        <m:r>
+          <m:rPr>
+            <m:sty m:val="p"/>
+          </m:rPr>
+          <m:t>{</m:t>
+        </m:r>
+        <m:r>
+          <m:rPr>
+            <m:nor/>
+          </m:rPr>
+          <m:t>no-op, edit, fine-tune, retrain</m:t>
+        </m:r>
+        <m:r>
+          <m:rPr>
+            <m:sty m:val="p"/>
+          </m:rPr>
+          <m:t>}</m:t>
+        </m:r>
+        <m:r>
+          <m:rPr>
+            <m:sty m:val="p"/>
+          </m:rPr>
+          <m:t>,</m:t>
+        </m:r>
       </m:oMath>
       <w:r>
         <w:tab/>
@@ -7570,7 +7551,15 @@
         <w:pStyle w:val="Text"/>
       </w:pPr>
       <w:r>
-        <w:t xml:space="preserve">with cost </w:t>
+        <w:t xml:space="preserve">where edit, fine-tune, and retrain stand for a knowledge edit, a parameter-efficient fine-tune, and a full retrain, in order of increasing aggressiveness. Action </w:t>
+      </w:r>
+      <m:oMath>
+        <m:r>
+          <m:t>a</m:t>
+        </m:r>
+      </m:oMath>
+      <w:r>
+        <w:t xml:space="preserve"> has cost </w:t>
       </w:r>
       <m:oMath>
         <m:r>
@@ -7868,7 +7857,7 @@
         </m:sSub>
       </m:oMath>
       <w:r>
-        <w:t xml:space="preserve">. Whether to keep the store is an outer comparison of the optimal average costs with and without retrieval (Section VIII).</w:t>
+        <w:t xml:space="preserve">. Whether to keep the store is an outer comparison of the optimal average costs with and without retrieval (Section VII).</w:t>
       </w:r>
     </w:p>
     <w:p>
@@ -8651,7 +8640,7 @@
         <w:pStyle w:val="Text"/>
       </w:pPr>
       <w:r>
-        <w:t xml:space="preserve">The single-threshold policy of Section V is the special case </w:t>
+        <w:t xml:space="preserve">The single-threshold policy of Section IV is the special case </w:t>
       </w:r>
       <m:oMath>
         <m:d>
@@ -8856,7 +8845,7 @@
         </m:d>
       </m:oMath>
       <w:r>
-        <w:t xml:space="preserve">, then both the increasing-tail and the submodularity conditions can fail, and the optimal policy need not be monotone. Section VI suggests this is possible whenever the required displacement direction rotates as staleness accumulates. A non-monotone numerical policy is then a prediction of the model and not a defect of the solver.</w:t>
+        <w:t xml:space="preserve">, then both the increasing-tail and the submodularity conditions can fail, and the optimal policy need not be monotone. Section V suggests this is possible whenever the required displacement direction rotates as staleness accumulates. A non-monotone numerical policy is then a prediction of the model and not a defect of the solver.</w:t>
       </w:r>
     </w:p>
     <w:p>
@@ -8922,7 +8911,7 @@
         </m:d>
       </m:oMath>
       <w:r>
-        <w:t xml:space="preserve"> that can be refreshed independently. In the notation of Section IV, a working retrieval system replaces </w:t>
+        <w:t xml:space="preserve"> that can be refreshed independently. In the notation of Section III, a working retrieval system replaces </w:t>
       </w:r>
       <m:oMath>
         <m:r>
@@ -9234,7 +9223,7 @@
         </m:r>
       </m:oMath>
       <w:r>
-        <w:t xml:space="preserve"> in Section V gives</w:t>
+        <w:t xml:space="preserve"> in Section IV gives</w:t>
       </w:r>
     </w:p>
     <w:p>
@@ -9545,12 +9534,13 @@
     <w:p>
       <w:pPr>
         <w:pStyle w:val="Equation"/>
+        <w:keepNext/>
         <w:tabs>
           <w:tab w:val="clear" w:pos="5040"/>
           <w:tab w:val="center" w:pos="2520"/>
           <w:tab w:val="right" w:pos="5040"/>
         </w:tabs>
-        <w:spacing w:before="60" w:after="60"/>
+        <w:spacing w:before="60" w:after="0"/>
       </w:pPr>
       <w:r>
         <w:tab/>
@@ -9645,6 +9635,22 @@
             </m:r>
           </m:e>
         </m:d>
+      </m:oMath>
+    </w:p>
+    <w:p>
+      <w:pPr>
+        <w:pStyle w:val="Equation"/>
+        <w:tabs>
+          <w:tab w:val="clear" w:pos="5040"/>
+          <w:tab w:val="center" w:pos="2520"/>
+          <w:tab w:val="right" w:pos="5040"/>
+        </w:tabs>
+        <w:spacing w:before="0" w:after="60"/>
+      </w:pPr>
+      <w:r>
+        <w:tab/>
+      </w:r>
+      <m:oMath>
         <m:r>
           <m:rPr>
             <m:sty m:val="p"/>
@@ -9779,7 +9785,7 @@
         </m:r>
       </m:oMath>
       <w:r>
-        <w:t xml:space="preserve">. Forms of drift that retrieval cannot correct still accumulate at their full rate against the parametric model and must eventually be repaired by the mechanisms of Sections VI and VII. For the measured share </w:t>
+        <w:t xml:space="preserve">. Forms of drift that retrieval cannot correct still accumulate at their full rate against the parametric model and must eventually be repaired by the mechanisms of Sections V and VI. For the measured share </w:t>
       </w:r>
       <m:oMath>
         <m:r>
@@ -9805,7 +9811,7 @@
         </m:r>
       </m:oMath>
       <w:r>
-        <w:t xml:space="preserve"> of Section IX, the right-hand side of (21) is about </w:t>
+        <w:t xml:space="preserve"> of Section VIII, the right-hand side of (21) is about </w:t>
       </w:r>
       <m:oMath>
         <m:r>
@@ -9888,7 +9894,7 @@
         </m:r>
       </m:oMath>
       <w:r>
-        <w:t xml:space="preserve"> is therefore an empirically monitored slope, estimated by the regression of Section V-D on a retrieval-on sample, not a design parameter that can be assumed correct once a store has been deployed.</w:t>
+        <w:t xml:space="preserve"> is therefore an empirically monitored slope, estimated by the regression of Section IV-D on a retrieval-on sample, not a design parameter that can be assumed correct once a store has been deployed.</w:t>
       </w:r>
     </w:p>
     <w:p>
@@ -9917,7 +9923,7 @@
         <w:pStyle w:val="Text"/>
       </w:pPr>
       <w:r>
-        <w:t xml:space="preserve">Sections IX-B and IX-C illustrate the comparative statics with stylized parameters chosen for readability and not for calibration; only the ratios in Table II are meaningful. Section IX-D then instantiates the measured inputs on a public model.</w:t>
+        <w:t xml:space="preserve">Sections VIII-B and VIII-C illustrate the comparative statics with stylized parameters chosen for readability and not for calibration; only the ratios in Table II are meaningful. Section VIII-D then instantiates the measured inputs on a public model.</w:t>
       </w:r>
     </w:p>
     <w:p>
@@ -10337,6 +10343,34 @@
           <m:t>1</m:t>
         </m:r>
       </m:oMath>
+      <w:r>
+        <w:rPr>
+          <w:sz w:val="16"/>
+          <w:szCs w:val="16"/>
+        </w:rPr>
+        <w:t xml:space="preserve"> (Second Header Row Gives </w:t>
+      </w:r>
+      <m:oMath>
+        <m:sSub>
+          <m:e>
+            <m:r>
+              <m:t>K</m:t>
+            </m:r>
+          </m:e>
+          <m:sub>
+            <m:r>
+              <m:t>R</m:t>
+            </m:r>
+          </m:sub>
+        </m:sSub>
+      </m:oMath>
+      <w:r>
+        <w:rPr>
+          <w:sz w:val="16"/>
+          <w:szCs w:val="16"/>
+        </w:rPr>
+        <w:t xml:space="preserve">)</w:t>
+      </w:r>
     </w:p>
     <w:tbl>
       <w:tblPr>
@@ -10345,14 +10379,14 @@
         <w:tblLayout w:type="fixed"/>
       </w:tblPr>
       <w:tblGrid>
-        <w:gridCol w:w="613"/>
-        <w:gridCol w:w="525"/>
-        <w:gridCol w:w="657"/>
-        <w:gridCol w:w="657"/>
-        <w:gridCol w:w="701"/>
-        <w:gridCol w:w="569"/>
-        <w:gridCol w:w="613"/>
-        <w:gridCol w:w="701"/>
+        <w:gridCol w:w="522"/>
+        <w:gridCol w:w="421"/>
+        <w:gridCol w:w="682"/>
+        <w:gridCol w:w="682"/>
+        <w:gridCol w:w="682"/>
+        <w:gridCol w:w="682"/>
+        <w:gridCol w:w="682"/>
+        <w:gridCol w:w="682"/>
       </w:tblGrid>
       <w:tr>
         <w:trPr>
@@ -10360,7 +10394,7 @@
         </w:trPr>
         <w:tc>
           <w:tcPr>
-            <w:tcW w:w="613" w:type="dxa"/>
+            <w:tcW w:w="522" w:type="dxa"/>
             <w:tcBorders>
               <w:top w:val="single" w:sz="8" w:space="0" w:color="000000"/>
               <w:bottom w:val="single" w:sz="4" w:space="0" w:color="000000"/>
@@ -10380,20 +10414,11 @@
                 <m:t>λ</m:t>
               </m:r>
             </m:oMath>
-            <w:r>
-              <w:rPr>
-                <w:b/>
-                <w:bCs/>
-                <w:sz w:val="13"/>
-                <w:szCs w:val="13"/>
-              </w:rPr>
-              <w:t xml:space="preserve"> (per day)</w:t>
-            </w:r>
           </w:p>
         </w:tc>
         <w:tc>
           <w:tcPr>
-            <w:tcW w:w="525" w:type="dxa"/>
+            <w:tcW w:w="421" w:type="dxa"/>
             <w:tcBorders>
               <w:top w:val="single" w:sz="8" w:space="0" w:color="000000"/>
               <w:bottom w:val="single" w:sz="4" w:space="0" w:color="000000"/>
@@ -10417,7 +10442,7 @@
         </w:tc>
         <w:tc>
           <w:tcPr>
-            <w:tcW w:w="657" w:type="dxa"/>
+            <w:tcW w:w="682" w:type="dxa"/>
             <w:tcBorders>
               <w:top w:val="single" w:sz="8" w:space="0" w:color="000000"/>
               <w:bottom w:val="single" w:sz="4" w:space="0" w:color="000000"/>
@@ -10449,52 +10474,11 @@
                 </m:sup>
               </m:sSup>
             </m:oMath>
-            <w:r>
-              <w:rPr>
-                <w:b/>
-                <w:bCs/>
-                <w:sz w:val="13"/>
-                <w:szCs w:val="13"/>
-              </w:rPr>
-              <w:t xml:space="preserve">, </w:t>
-            </w:r>
-            <m:oMath>
-              <m:sSub>
-                <m:e>
-                  <m:r>
-                    <m:t>K</m:t>
-                  </m:r>
-                </m:e>
-                <m:sub>
-                  <m:r>
-                    <m:t>R</m:t>
-                  </m:r>
-                </m:sub>
-              </m:sSub>
-              <m:r>
-                <m:rPr>
-                  <m:sty m:val="p"/>
-                </m:rPr>
-                <m:t>=</m:t>
-              </m:r>
-              <m:sSup>
-                <m:e>
-                  <m:r>
-                    <m:t>10</m:t>
-                  </m:r>
-                </m:e>
-                <m:sup>
-                  <m:r>
-                    <m:t>2</m:t>
-                  </m:r>
-                </m:sup>
-              </m:sSup>
-            </m:oMath>
           </w:p>
         </w:tc>
         <w:tc>
           <w:tcPr>
-            <w:tcW w:w="657" w:type="dxa"/>
+            <w:tcW w:w="682" w:type="dxa"/>
             <w:tcBorders>
               <w:top w:val="single" w:sz="8" w:space="0" w:color="000000"/>
               <w:bottom w:val="single" w:sz="4" w:space="0" w:color="000000"/>
@@ -10526,52 +10510,11 @@
                 </m:sup>
               </m:sSup>
             </m:oMath>
-            <w:r>
-              <w:rPr>
-                <w:b/>
-                <w:bCs/>
-                <w:sz w:val="13"/>
-                <w:szCs w:val="13"/>
-              </w:rPr>
-              <w:t xml:space="preserve">, </w:t>
-            </w:r>
-            <m:oMath>
-              <m:sSub>
-                <m:e>
-                  <m:r>
-                    <m:t>K</m:t>
-                  </m:r>
-                </m:e>
-                <m:sub>
-                  <m:r>
-                    <m:t>R</m:t>
-                  </m:r>
-                </m:sub>
-              </m:sSub>
-              <m:r>
-                <m:rPr>
-                  <m:sty m:val="p"/>
-                </m:rPr>
-                <m:t>=</m:t>
-              </m:r>
-              <m:sSup>
-                <m:e>
-                  <m:r>
-                    <m:t>10</m:t>
-                  </m:r>
-                </m:e>
-                <m:sup>
-                  <m:r>
-                    <m:t>4</m:t>
-                  </m:r>
-                </m:sup>
-              </m:sSup>
-            </m:oMath>
           </w:p>
         </w:tc>
         <w:tc>
           <w:tcPr>
-            <w:tcW w:w="701" w:type="dxa"/>
+            <w:tcW w:w="682" w:type="dxa"/>
             <w:tcBorders>
               <w:top w:val="single" w:sz="8" w:space="0" w:color="000000"/>
               <w:bottom w:val="single" w:sz="4" w:space="0" w:color="000000"/>
@@ -10603,52 +10546,11 @@
                 </m:sup>
               </m:sSup>
             </m:oMath>
-            <w:r>
-              <w:rPr>
-                <w:b/>
-                <w:bCs/>
-                <w:sz w:val="13"/>
-                <w:szCs w:val="13"/>
-              </w:rPr>
-              <w:t xml:space="preserve">, </w:t>
-            </w:r>
-            <m:oMath>
-              <m:sSub>
-                <m:e>
-                  <m:r>
-                    <m:t>K</m:t>
-                  </m:r>
-                </m:e>
-                <m:sub>
-                  <m:r>
-                    <m:t>R</m:t>
-                  </m:r>
-                </m:sub>
-              </m:sSub>
-              <m:r>
-                <m:rPr>
-                  <m:sty m:val="p"/>
-                </m:rPr>
-                <m:t>=</m:t>
-              </m:r>
-              <m:sSup>
-                <m:e>
-                  <m:r>
-                    <m:t>10</m:t>
-                  </m:r>
-                </m:e>
-                <m:sup>
-                  <m:r>
-                    <m:t>6</m:t>
-                  </m:r>
-                </m:sup>
-              </m:sSup>
-            </m:oMath>
           </w:p>
         </w:tc>
         <w:tc>
           <w:tcPr>
-            <w:tcW w:w="569" w:type="dxa"/>
+            <w:tcW w:w="682" w:type="dxa"/>
             <w:tcBorders>
               <w:top w:val="single" w:sz="8" w:space="0" w:color="000000"/>
               <w:bottom w:val="single" w:sz="4" w:space="0" w:color="000000"/>
@@ -10680,52 +10582,11 @@
                 </m:sup>
               </m:sSup>
             </m:oMath>
-            <w:r>
-              <w:rPr>
-                <w:b/>
-                <w:bCs/>
-                <w:sz w:val="13"/>
-                <w:szCs w:val="13"/>
-              </w:rPr>
-              <w:t xml:space="preserve">, </w:t>
-            </w:r>
-            <m:oMath>
-              <m:sSub>
-                <m:e>
-                  <m:r>
-                    <m:t>K</m:t>
-                  </m:r>
-                </m:e>
-                <m:sub>
-                  <m:r>
-                    <m:t>R</m:t>
-                  </m:r>
-                </m:sub>
-              </m:sSub>
-              <m:r>
-                <m:rPr>
-                  <m:sty m:val="p"/>
-                </m:rPr>
-                <m:t>=</m:t>
-              </m:r>
-              <m:sSup>
-                <m:e>
-                  <m:r>
-                    <m:t>10</m:t>
-                  </m:r>
-                </m:e>
-                <m:sup>
-                  <m:r>
-                    <m:t>2</m:t>
-                  </m:r>
-                </m:sup>
-              </m:sSup>
-            </m:oMath>
           </w:p>
         </w:tc>
         <w:tc>
           <w:tcPr>
-            <w:tcW w:w="613" w:type="dxa"/>
+            <w:tcW w:w="682" w:type="dxa"/>
             <w:tcBorders>
               <w:top w:val="single" w:sz="8" w:space="0" w:color="000000"/>
               <w:bottom w:val="single" w:sz="4" w:space="0" w:color="000000"/>
@@ -10757,52 +10618,11 @@
                 </m:sup>
               </m:sSup>
             </m:oMath>
-            <w:r>
-              <w:rPr>
-                <w:b/>
-                <w:bCs/>
-                <w:sz w:val="13"/>
-                <w:szCs w:val="13"/>
-              </w:rPr>
-              <w:t xml:space="preserve">, </w:t>
-            </w:r>
-            <m:oMath>
-              <m:sSub>
-                <m:e>
-                  <m:r>
-                    <m:t>K</m:t>
-                  </m:r>
-                </m:e>
-                <m:sub>
-                  <m:r>
-                    <m:t>R</m:t>
-                  </m:r>
-                </m:sub>
-              </m:sSub>
-              <m:r>
-                <m:rPr>
-                  <m:sty m:val="p"/>
-                </m:rPr>
-                <m:t>=</m:t>
-              </m:r>
-              <m:sSup>
-                <m:e>
-                  <m:r>
-                    <m:t>10</m:t>
-                  </m:r>
-                </m:e>
-                <m:sup>
-                  <m:r>
-                    <m:t>4</m:t>
-                  </m:r>
-                </m:sup>
-              </m:sSup>
-            </m:oMath>
           </w:p>
         </w:tc>
         <w:tc>
           <w:tcPr>
-            <w:tcW w:w="701" w:type="dxa"/>
+            <w:tcW w:w="682" w:type="dxa"/>
             <w:tcBorders>
               <w:top w:val="single" w:sz="8" w:space="0" w:color="000000"/>
               <w:bottom w:val="single" w:sz="4" w:space="0" w:color="000000"/>
@@ -10834,34 +10654,217 @@
                 </m:sup>
               </m:sSup>
             </m:oMath>
+          </w:p>
+        </w:tc>
+      </w:tr>
+      <w:tr>
+        <w:trPr>
+          <w:cantSplit/>
+        </w:trPr>
+        <w:tc>
+          <w:tcPr>
+            <w:tcW w:w="522" w:type="dxa"/>
+            <w:tcBorders/>
+            <w:tcMar>
+              <w:left w:w="40" w:type="dxa"/>
+              <w:right w:w="40" w:type="dxa"/>
+            </w:tcMar>
+          </w:tcPr>
+          <w:p>
+            <w:pPr>
+              <w:spacing w:before="20" w:after="20"/>
+              <w:jc w:val="left"/>
+            </w:pPr>
             <w:r>
               <w:rPr>
-                <w:b/>
-                <w:bCs/>
                 <w:sz w:val="13"/>
                 <w:szCs w:val="13"/>
               </w:rPr>
-              <w:t xml:space="preserve">, </w:t>
+              <w:t xml:space="preserve">(per day)</w:t>
             </w:r>
+          </w:p>
+        </w:tc>
+        <w:tc>
+          <w:tcPr>
+            <w:tcW w:w="421" w:type="dxa"/>
+            <w:tcBorders/>
+            <w:tcMar>
+              <w:left w:w="40" w:type="dxa"/>
+              <w:right w:w="40" w:type="dxa"/>
+            </w:tcMar>
+          </w:tcPr>
+          <w:p>
+            <w:pPr>
+              <w:spacing w:before="20" w:after="20"/>
+              <w:jc w:val="center"/>
+            </w:pPr>
+          </w:p>
+        </w:tc>
+        <w:tc>
+          <w:tcPr>
+            <w:tcW w:w="682" w:type="dxa"/>
+            <w:tcBorders/>
+            <w:tcMar>
+              <w:left w:w="40" w:type="dxa"/>
+              <w:right w:w="40" w:type="dxa"/>
+            </w:tcMar>
+          </w:tcPr>
+          <w:p>
+            <w:pPr>
+              <w:spacing w:before="20" w:after="20"/>
+              <w:jc w:val="center"/>
+            </w:pPr>
             <m:oMath>
-              <m:sSub>
+              <m:sSup>
                 <m:e>
                   <m:r>
-                    <m:t>K</m:t>
+                    <m:t>10</m:t>
                   </m:r>
                 </m:e>
-                <m:sub>
+                <m:sup>
                   <m:r>
-                    <m:t>R</m:t>
+                    <m:t>2</m:t>
                   </m:r>
-                </m:sub>
-              </m:sSub>
-              <m:r>
-                <m:rPr>
-                  <m:sty m:val="p"/>
-                </m:rPr>
-                <m:t>=</m:t>
-              </m:r>
+                </m:sup>
+              </m:sSup>
+            </m:oMath>
+          </w:p>
+        </w:tc>
+        <w:tc>
+          <w:tcPr>
+            <w:tcW w:w="682" w:type="dxa"/>
+            <w:tcBorders/>
+            <w:tcMar>
+              <w:left w:w="40" w:type="dxa"/>
+              <w:right w:w="40" w:type="dxa"/>
+            </w:tcMar>
+          </w:tcPr>
+          <w:p>
+            <w:pPr>
+              <w:spacing w:before="20" w:after="20"/>
+              <w:jc w:val="center"/>
+            </w:pPr>
+            <m:oMath>
+              <m:sSup>
+                <m:e>
+                  <m:r>
+                    <m:t>10</m:t>
+                  </m:r>
+                </m:e>
+                <m:sup>
+                  <m:r>
+                    <m:t>4</m:t>
+                  </m:r>
+                </m:sup>
+              </m:sSup>
+            </m:oMath>
+          </w:p>
+        </w:tc>
+        <w:tc>
+          <w:tcPr>
+            <w:tcW w:w="682" w:type="dxa"/>
+            <w:tcBorders/>
+            <w:tcMar>
+              <w:left w:w="40" w:type="dxa"/>
+              <w:right w:w="40" w:type="dxa"/>
+            </w:tcMar>
+          </w:tcPr>
+          <w:p>
+            <w:pPr>
+              <w:spacing w:before="20" w:after="20"/>
+              <w:jc w:val="center"/>
+            </w:pPr>
+            <m:oMath>
+              <m:sSup>
+                <m:e>
+                  <m:r>
+                    <m:t>10</m:t>
+                  </m:r>
+                </m:e>
+                <m:sup>
+                  <m:r>
+                    <m:t>6</m:t>
+                  </m:r>
+                </m:sup>
+              </m:sSup>
+            </m:oMath>
+          </w:p>
+        </w:tc>
+        <w:tc>
+          <w:tcPr>
+            <w:tcW w:w="682" w:type="dxa"/>
+            <w:tcBorders/>
+            <w:tcMar>
+              <w:left w:w="40" w:type="dxa"/>
+              <w:right w:w="40" w:type="dxa"/>
+            </w:tcMar>
+          </w:tcPr>
+          <w:p>
+            <w:pPr>
+              <w:spacing w:before="20" w:after="20"/>
+              <w:jc w:val="center"/>
+            </w:pPr>
+            <m:oMath>
+              <m:sSup>
+                <m:e>
+                  <m:r>
+                    <m:t>10</m:t>
+                  </m:r>
+                </m:e>
+                <m:sup>
+                  <m:r>
+                    <m:t>2</m:t>
+                  </m:r>
+                </m:sup>
+              </m:sSup>
+            </m:oMath>
+          </w:p>
+        </w:tc>
+        <w:tc>
+          <w:tcPr>
+            <w:tcW w:w="682" w:type="dxa"/>
+            <w:tcBorders/>
+            <w:tcMar>
+              <w:left w:w="40" w:type="dxa"/>
+              <w:right w:w="40" w:type="dxa"/>
+            </w:tcMar>
+          </w:tcPr>
+          <w:p>
+            <w:pPr>
+              <w:spacing w:before="20" w:after="20"/>
+              <w:jc w:val="center"/>
+            </w:pPr>
+            <m:oMath>
+              <m:sSup>
+                <m:e>
+                  <m:r>
+                    <m:t>10</m:t>
+                  </m:r>
+                </m:e>
+                <m:sup>
+                  <m:r>
+                    <m:t>4</m:t>
+                  </m:r>
+                </m:sup>
+              </m:sSup>
+            </m:oMath>
+          </w:p>
+        </w:tc>
+        <w:tc>
+          <w:tcPr>
+            <w:tcW w:w="682" w:type="dxa"/>
+            <w:tcBorders/>
+            <w:tcMar>
+              <w:left w:w="40" w:type="dxa"/>
+              <w:right w:w="40" w:type="dxa"/>
+            </w:tcMar>
+          </w:tcPr>
+          <w:p>
+            <w:pPr>
+              <w:spacing w:before="20" w:after="20"/>
+              <w:jc w:val="center"/>
+            </w:pPr>
+            <m:oMath>
               <m:sSup>
                 <m:e>
                   <m:r>
@@ -10884,7 +10887,7 @@
         </w:trPr>
         <w:tc>
           <w:tcPr>
-            <w:tcW w:w="613" w:type="dxa"/>
+            <w:tcW w:w="522" w:type="dxa"/>
             <w:tcBorders/>
             <w:tcMar>
               <w:left w:w="40" w:type="dxa"/>
@@ -10907,7 +10910,7 @@
         </w:tc>
         <w:tc>
           <w:tcPr>
-            <w:tcW w:w="525" w:type="dxa"/>
+            <w:tcW w:w="421" w:type="dxa"/>
             <w:tcBorders/>
             <w:tcMar>
               <w:left w:w="40" w:type="dxa"/>
@@ -10930,7 +10933,7 @@
         </w:tc>
         <w:tc>
           <w:tcPr>
-            <w:tcW w:w="657" w:type="dxa"/>
+            <w:tcW w:w="682" w:type="dxa"/>
             <w:tcBorders/>
             <w:tcMar>
               <w:left w:w="40" w:type="dxa"/>
@@ -10953,7 +10956,7 @@
         </w:tc>
         <w:tc>
           <w:tcPr>
-            <w:tcW w:w="657" w:type="dxa"/>
+            <w:tcW w:w="682" w:type="dxa"/>
             <w:tcBorders/>
             <w:tcMar>
               <w:left w:w="40" w:type="dxa"/>
@@ -10976,7 +10979,7 @@
         </w:tc>
         <w:tc>
           <w:tcPr>
-            <w:tcW w:w="701" w:type="dxa"/>
+            <w:tcW w:w="682" w:type="dxa"/>
             <w:tcBorders/>
             <w:tcMar>
               <w:left w:w="40" w:type="dxa"/>
@@ -10999,7 +11002,7 @@
         </w:tc>
         <w:tc>
           <w:tcPr>
-            <w:tcW w:w="569" w:type="dxa"/>
+            <w:tcW w:w="682" w:type="dxa"/>
             <w:tcBorders/>
             <w:tcMar>
               <w:left w:w="40" w:type="dxa"/>
@@ -11022,7 +11025,7 @@
         </w:tc>
         <w:tc>
           <w:tcPr>
-            <w:tcW w:w="613" w:type="dxa"/>
+            <w:tcW w:w="682" w:type="dxa"/>
             <w:tcBorders/>
             <w:tcMar>
               <w:left w:w="40" w:type="dxa"/>
@@ -11045,7 +11048,7 @@
         </w:tc>
         <w:tc>
           <w:tcPr>
-            <w:tcW w:w="701" w:type="dxa"/>
+            <w:tcW w:w="682" w:type="dxa"/>
             <w:tcBorders/>
             <w:tcMar>
               <w:left w:w="40" w:type="dxa"/>
@@ -11073,7 +11076,7 @@
         </w:trPr>
         <w:tc>
           <w:tcPr>
-            <w:tcW w:w="613" w:type="dxa"/>
+            <w:tcW w:w="522" w:type="dxa"/>
             <w:tcBorders/>
             <w:tcMar>
               <w:left w:w="40" w:type="dxa"/>
@@ -11096,7 +11099,7 @@
         </w:tc>
         <w:tc>
           <w:tcPr>
-            <w:tcW w:w="525" w:type="dxa"/>
+            <w:tcW w:w="421" w:type="dxa"/>
             <w:tcBorders/>
             <w:tcMar>
               <w:left w:w="40" w:type="dxa"/>
@@ -11119,7 +11122,7 @@
         </w:tc>
         <w:tc>
           <w:tcPr>
-            <w:tcW w:w="657" w:type="dxa"/>
+            <w:tcW w:w="682" w:type="dxa"/>
             <w:tcBorders/>
             <w:tcMar>
               <w:left w:w="40" w:type="dxa"/>
@@ -11142,7 +11145,7 @@
         </w:tc>
         <w:tc>
           <w:tcPr>
-            <w:tcW w:w="657" w:type="dxa"/>
+            <w:tcW w:w="682" w:type="dxa"/>
             <w:tcBorders/>
             <w:tcMar>
               <w:left w:w="40" w:type="dxa"/>
@@ -11165,7 +11168,7 @@
         </w:tc>
         <w:tc>
           <w:tcPr>
-            <w:tcW w:w="701" w:type="dxa"/>
+            <w:tcW w:w="682" w:type="dxa"/>
             <w:tcBorders/>
             <w:tcMar>
               <w:left w:w="40" w:type="dxa"/>
@@ -11188,7 +11191,7 @@
         </w:tc>
         <w:tc>
           <w:tcPr>
-            <w:tcW w:w="569" w:type="dxa"/>
+            <w:tcW w:w="682" w:type="dxa"/>
             <w:tcBorders/>
             <w:tcMar>
               <w:left w:w="40" w:type="dxa"/>
@@ -11211,7 +11214,7 @@
         </w:tc>
         <w:tc>
           <w:tcPr>
-            <w:tcW w:w="613" w:type="dxa"/>
+            <w:tcW w:w="682" w:type="dxa"/>
             <w:tcBorders/>
             <w:tcMar>
               <w:left w:w="40" w:type="dxa"/>
@@ -11234,7 +11237,7 @@
         </w:tc>
         <w:tc>
           <w:tcPr>
-            <w:tcW w:w="701" w:type="dxa"/>
+            <w:tcW w:w="682" w:type="dxa"/>
             <w:tcBorders/>
             <w:tcMar>
               <w:left w:w="40" w:type="dxa"/>
@@ -11262,7 +11265,7 @@
         </w:trPr>
         <w:tc>
           <w:tcPr>
-            <w:tcW w:w="613" w:type="dxa"/>
+            <w:tcW w:w="522" w:type="dxa"/>
             <w:tcBorders/>
             <w:tcMar>
               <w:left w:w="40" w:type="dxa"/>
@@ -11285,7 +11288,7 @@
         </w:tc>
         <w:tc>
           <w:tcPr>
-            <w:tcW w:w="525" w:type="dxa"/>
+            <w:tcW w:w="421" w:type="dxa"/>
             <w:tcBorders/>
             <w:tcMar>
               <w:left w:w="40" w:type="dxa"/>
@@ -11308,7 +11311,7 @@
         </w:tc>
         <w:tc>
           <w:tcPr>
-            <w:tcW w:w="657" w:type="dxa"/>
+            <w:tcW w:w="682" w:type="dxa"/>
             <w:tcBorders/>
             <w:tcMar>
               <w:left w:w="40" w:type="dxa"/>
@@ -11331,7 +11334,7 @@
         </w:tc>
         <w:tc>
           <w:tcPr>
-            <w:tcW w:w="657" w:type="dxa"/>
+            <w:tcW w:w="682" w:type="dxa"/>
             <w:tcBorders/>
             <w:tcMar>
               <w:left w:w="40" w:type="dxa"/>
@@ -11354,7 +11357,7 @@
         </w:tc>
         <w:tc>
           <w:tcPr>
-            <w:tcW w:w="701" w:type="dxa"/>
+            <w:tcW w:w="682" w:type="dxa"/>
             <w:tcBorders/>
             <w:tcMar>
               <w:left w:w="40" w:type="dxa"/>
@@ -11377,7 +11380,7 @@
         </w:tc>
         <w:tc>
           <w:tcPr>
-            <w:tcW w:w="569" w:type="dxa"/>
+            <w:tcW w:w="682" w:type="dxa"/>
             <w:tcBorders/>
             <w:tcMar>
               <w:left w:w="40" w:type="dxa"/>
@@ -11400,7 +11403,7 @@
         </w:tc>
         <w:tc>
           <w:tcPr>
-            <w:tcW w:w="613" w:type="dxa"/>
+            <w:tcW w:w="682" w:type="dxa"/>
             <w:tcBorders/>
             <w:tcMar>
               <w:left w:w="40" w:type="dxa"/>
@@ -11423,7 +11426,7 @@
         </w:tc>
         <w:tc>
           <w:tcPr>
-            <w:tcW w:w="701" w:type="dxa"/>
+            <w:tcW w:w="682" w:type="dxa"/>
             <w:tcBorders/>
             <w:tcMar>
               <w:left w:w="40" w:type="dxa"/>
@@ -11451,7 +11454,7 @@
         </w:trPr>
         <w:tc>
           <w:tcPr>
-            <w:tcW w:w="613" w:type="dxa"/>
+            <w:tcW w:w="522" w:type="dxa"/>
             <w:tcBorders>
               <w:bottom w:val="single" w:sz="8" w:space="0" w:color="000000"/>
             </w:tcBorders>
@@ -11476,7 +11479,7 @@
         </w:tc>
         <w:tc>
           <w:tcPr>
-            <w:tcW w:w="525" w:type="dxa"/>
+            <w:tcW w:w="421" w:type="dxa"/>
             <w:tcBorders>
               <w:bottom w:val="single" w:sz="8" w:space="0" w:color="000000"/>
             </w:tcBorders>
@@ -11501,7 +11504,7 @@
         </w:tc>
         <w:tc>
           <w:tcPr>
-            <w:tcW w:w="657" w:type="dxa"/>
+            <w:tcW w:w="682" w:type="dxa"/>
             <w:tcBorders>
               <w:bottom w:val="single" w:sz="8" w:space="0" w:color="000000"/>
             </w:tcBorders>
@@ -11526,7 +11529,7 @@
         </w:tc>
         <w:tc>
           <w:tcPr>
-            <w:tcW w:w="657" w:type="dxa"/>
+            <w:tcW w:w="682" w:type="dxa"/>
             <w:tcBorders>
               <w:bottom w:val="single" w:sz="8" w:space="0" w:color="000000"/>
             </w:tcBorders>
@@ -11551,7 +11554,7 @@
         </w:tc>
         <w:tc>
           <w:tcPr>
-            <w:tcW w:w="701" w:type="dxa"/>
+            <w:tcW w:w="682" w:type="dxa"/>
             <w:tcBorders>
               <w:bottom w:val="single" w:sz="8" w:space="0" w:color="000000"/>
             </w:tcBorders>
@@ -11576,7 +11579,7 @@
         </w:tc>
         <w:tc>
           <w:tcPr>
-            <w:tcW w:w="569" w:type="dxa"/>
+            <w:tcW w:w="682" w:type="dxa"/>
             <w:tcBorders>
               <w:bottom w:val="single" w:sz="8" w:space="0" w:color="000000"/>
             </w:tcBorders>
@@ -11601,7 +11604,7 @@
         </w:tc>
         <w:tc>
           <w:tcPr>
-            <w:tcW w:w="613" w:type="dxa"/>
+            <w:tcW w:w="682" w:type="dxa"/>
             <w:tcBorders>
               <w:bottom w:val="single" w:sz="8" w:space="0" w:color="000000"/>
             </w:tcBorders>
@@ -11626,7 +11629,7 @@
         </w:tc>
         <w:tc>
           <w:tcPr>
-            <w:tcW w:w="701" w:type="dxa"/>
+            <w:tcW w:w="682" w:type="dxa"/>
             <w:tcBorders>
               <w:bottom w:val="single" w:sz="8" w:space="0" w:color="000000"/>
             </w:tcBorders>
@@ -11836,7 +11839,7 @@
         </m:sSup>
       </m:oMath>
       <w:r>
-        <w:t xml:space="preserve"> by a factor of 100, again the square-root curvature. Third, the forgetting-augmented optimum of Section VI implies that, at fixed </w:t>
+        <w:t xml:space="preserve"> by a factor of 100, again the square-root curvature. Third, the forgetting-augmented optimum of Section V implies that, at fixed </w:t>
       </w:r>
       <m:oMath>
         <m:r>
@@ -11983,7 +11986,7 @@
         <w:pStyle w:val="Text"/>
       </w:pPr>
       <w:r>
-        <w:t xml:space="preserve">A Weibull inter-event law with shape above one gives an increasing hazard and a decreasing mean residual life; shape below one gives the opposite; shape one recovers the Poisson case. Section V predicts that a policy that shortens the calendar interval as time since the last shock grows beats the memoryless threshold under decreasing mean residual life, and that the same heuristic loses under increasing mean residual life. We have not run this experiment. For any fitted arrival model the predictions can be checked by solving the regime-dependent MDP of Section VII. If they are confirmed, the shape of the arrival hazard is a first-order determinant of the policy class an organization should adopt, and it is estimable from historical detector alarms.</w:t>
+        <w:t xml:space="preserve">A Weibull inter-event law with shape above one gives an increasing hazard and a decreasing mean residual life; shape below one gives the opposite; shape one recovers the Poisson case. Section IV predicts that a policy that shortens the calendar interval as time since the last shock grows beats the memoryless threshold under decreasing mean residual life, and that the same heuristic loses under increasing mean residual life. We have not run this experiment. For any fitted arrival model the predictions can be checked by solving the regime-dependent MDP of Section VI. If they are confirmed, the shape of the arrival hazard is a first-order determinant of the policy class an organization should adopt, and it is estimable from historical detector alarms.</w:t>
       </w:r>
     </w:p>
     <w:p>
@@ -12105,7 +12108,7 @@
         </m:r>
       </m:oMath>
       <w:r>
-        <w:t xml:space="preserve">). Both trajectories are well described by the affine mean of Section V. Over this horizon 180 events are expected, and the expected fraction of distinct dynamic facts that have changed at least once is </w:t>
+        <w:t xml:space="preserve">). Both trajectories are well described by the affine mean of Section IV. Over this horizon 180 events are expected, and the expected fraction of distinct dynamic facts that have changed at least once is </w:t>
       </w:r>
       <m:oMath>
         <m:r>
@@ -13255,7 +13258,7 @@
         <w:t xml:space="preserve">Identifiability.</w:t>
       </w:r>
       <w:r>
-        <w:t xml:space="preserve"> The estimator of Section V-D needs repeated full cycles: staleness accumulating from a reset, a repair, and a subsequent reset. Organizations that repair very infrequently, or that change mechanism or scoring method between cycles, may lack the record needed to estimate </w:t>
+        <w:t xml:space="preserve"> The estimator of Section IV-D needs repeated full cycles: staleness accumulating from a reset, a repair, and a subsequent reset. Organizations that repair very infrequently, or that change mechanism or scoring method between cycles, may lack the record needed to estimate </w:t>
       </w:r>
       <m:oMath>
         <m:r>
@@ -13369,7 +13372,7 @@
         </m:sSub>
       </m:oMath>
       <w:r>
-        <w:t xml:space="preserve"> themselves drift, the fixed-parameter control problem becomes an adaptive-control problem, and the estimator of Section V-D must be replaced by an online filter.</w:t>
+        <w:t xml:space="preserve"> themselves drift, the fixed-parameter control problem becomes an adaptive-control problem, and the estimator of Section IV-D must be replaced by an online filter.</w:t>
       </w:r>
     </w:p>
     <w:p>

</xml_diff>